<commit_message>
Name Elster's three optimality conditions in the prose version
Introduce all three in the Expectations paragraph and map the three
failures onto them in the conclusion, so the piece engages with the
model's own machinery rather than only its components. Body holds at
300 words; trims elsewhere pay for the addition.

Co-Authored-By: Claude Opus 5 <noreply@anthropic.com>
Claude-Session: https://claude.ai/code/session_01VAVAfzFozPikTCTQCjZyD3
</commit_message>
<xml_diff>
--- a/decision-making-module/13-prose/MarshallWace_IRC_prose.docx
+++ b/decision-making-module/13-prose/MarshallWace_IRC_prose.docx
@@ -55,7 +55,7 @@
           <w:i w:val="0"/>
           <w:sz w:val="20"/>
         </w:rPr>
-        <w:t>Word count: 299 (the six paragraphs below; header, figure captions, references and appendix excluded).</w:t>
+        <w:t>Word count: 300 (the six paragraphs below; header, figure captions, references and appendix excluded).</w:t>
       </w:r>
     </w:p>
     <w:p>
@@ -83,7 +83,7 @@
           <w:i w:val="0"/>
           <w:sz w:val="22"/>
         </w:rPr>
-        <w:t>IRC begins with the full set of options. I saw two: accept and lose my placement, degree and ACA, or decline. A third never occurred to me: asking Marshall Wace to hold the role for eight months. My option set was incomplete from the start.</w:t>
+        <w:t>IRC begins with the full set of options. I saw two: accept and lose my placement, degree and ACA, or decline. A third never occurred to me: asking them to hold the role eight months. My option set was incomplete from the start.</w:t>
       </w:r>
     </w:p>
     <w:p>
@@ -97,7 +97,7 @@
           <w:i w:val="0"/>
           <w:sz w:val="22"/>
         </w:rPr>
-        <w:t>My preferences were financial security, the ACA, worthwhile work, and a career not narrowed at twenty-one. Elster (2007) treats preferences as given, so wanting the money was not itself a failure. On these alone, declining was defensible.</w:t>
+        <w:t>My preferences were financial security, the ACA, worthwhile work, and a career kept open. Elster (2007) treats preferences as given, so wanting the money was not itself a failure. On these alone, declining was defensible.</w:t>
       </w:r>
     </w:p>
     <w:p>
@@ -165,7 +165,7 @@
           <w:i w:val="0"/>
           <w:sz w:val="22"/>
         </w:rPr>
-        <w:t>My expectations are where it falls apart. I believed the gap was £82,000 a year and the weeks ran to sixty hours. The hours were right; the gap was £37,898 after tax, National Insurance and student loan, wrong by £44,102. Worse, that figure argued for accepting, yet I declined. Elster (2007, p. 191) requires that an action follow from the beliefs justifying it.</w:t>
+        <w:t>My expectations are where it falls apart. I believed the gap was £82,000 and the weeks sixty hours. The hours were right; the gap was £37,898 after tax, National Insurance and student loan, wrong by £44,102. Worse, it argued for accepting, yet I declined. Elster (2007, p. 191) requires three things: an optimal action given the beliefs, beliefs best supported by the evidence, and evidence from optimal search.</w:t>
       </w:r>
     </w:p>
     <w:p>
@@ -179,7 +179,7 @@
           <w:i w:val="0"/>
           <w:sz w:val="22"/>
         </w:rPr>
-        <w:t>The evidence behind it was a headline figure, nothing more. Twenty minutes of arithmetic would have corrected it; I am training as an accountant. I never did it, because I had already settled on declining, a preference steering the search rather than evidence steering the belief.</w:t>
+        <w:t>The evidence behind it was a headline figure, nothing more. Twenty minutes of arithmetic would have corrected it; I am training as an accountant. I never did it, because I had already settled on declining, a preference steering the search.</w:t>
       </w:r>
     </w:p>
     <w:p>
@@ -193,7 +193,7 @@
           <w:i w:val="0"/>
           <w:sz w:val="22"/>
         </w:rPr>
-        <w:t>What moved me was £27,000 of tuition, spent either way. IRC has no box for it: it values actions only by what follows. Nor can it say how much search is enough (Hargreaves Heap et al., 1992, p. 15). Conlisk (1996, p. 687) shows why: pricing deliberation needs deliberation, “an infinite and seemingly intractable regress”. My preferences steered the search, the search misled the belief, and the action ignored it.</w:t>
+        <w:t>What moved me was £27,000 of tuition, spent either way. IRC has no box for it: it values actions only by what follows. Nor can it say how much search is enough (Hargreaves Heap et al., 1992, p. 15). Conlisk (1996, p. 687) shows why: pricing deliberation needs deliberation, “an infinite and seemingly intractable regress”. I failed all three in order: my search was not optimal, my belief outran the evidence, and my action ignored it.</w:t>
       </w:r>
     </w:p>
     <w:p>

</xml_diff>